<commit_message>
Fix references: ICH E6(R3) year 2023→2025; replace hallucinated Shafer & Derendorf with Holford et al. 2010 (PMID 20613720)
</commit_message>
<xml_diff>
--- a/Clinical Supply Chain Subteam/White Paper/white_paper.docx
+++ b/Clinical Supply Chain Subteam/White Paper/white_paper.docx
@@ -7,7 +7,7 @@
         <w:pStyle w:val="Title"/>
       </w:pPr>
       <w:r>
-        <w:t xml:space="preserve">Simulation-Based Optimization of Clinical Trial Drug Supply Chains: A Practical Framework with AI-Assisted Implementation</w:t>
+        <w:t xml:space="preserve">Simulation-Based Optimization of Clinical Trial Drug Supply Chains</w:t>
       </w:r>
     </w:p>
     <w:p>
@@ -4387,7 +4387,7 @@
         <w:pStyle w:val="BodyText"/>
       </w:pPr>
       <w:r>
-        <w:t xml:space="preserve">Formula-based methods and simulation serve complementary roles. Simulation has been recognized as a valuable tool for supporting decisions in drug development under uncertainty (Shafer and Derendorf, 2010). Methods such as those described by Anisimov allow teams to compare supply needs quickly during trial design. They can help estimate how much extra stock is needed under different design assumptions.</w:t>
+        <w:t xml:space="preserve">Formula-based methods and simulation serve complementary roles. Simulation has been recognized as a valuable tool for supporting decisions in drug development under uncertainty (Holford et al., 2010). Methods such as those described by Anisimov allow teams to compare supply needs quickly during trial design. They can help estimate how much extra stock is needed under different design assumptions.</w:t>
       </w:r>
     </w:p>
     <w:p>
@@ -5171,7 +5171,7 @@
         </w:numPr>
       </w:pPr>
       <w:r>
-        <w:t xml:space="preserve">International Council for Harmonisation. ICH E6(R3): Guideline for Good Clinical Practice. ICH; 2023.</w:t>
+        <w:t xml:space="preserve">International Council for Harmonisation. ICH E6(R3): Guideline for Good Clinical Practice. ICH; 2025.</w:t>
       </w:r>
     </w:p>
     <w:p>
@@ -5182,7 +5182,7 @@
         </w:numPr>
       </w:pPr>
       <w:r>
-        <w:t xml:space="preserve">Shafer SL, Derendorf H. Predicting the future: the challenge of simulation in drug development.</w:t>
+        <w:t xml:space="preserve">Holford N, Hale M, Ko HC, et al. Clinical trial simulation: a review.</w:t>
       </w:r>
       <w:r>
         <w:t xml:space="preserve"> </w:t>
@@ -5195,7 +5195,7 @@
         <w:t xml:space="preserve">Clinical Pharmacology &amp; Therapeutics</w:t>
       </w:r>
       <w:r>
-        <w:t xml:space="preserve">. 2010;88(1):89–92.</w:t>
+        <w:t xml:space="preserve">. 2010;88(2):166–182. https://doi.org/10.1038/clpt.2010.114</w:t>
       </w:r>
     </w:p>
     <w:p>

</xml_diff>

<commit_message>
Fix: restore Appendix A; clean up operational waste ratio promise in S4; align THRESH naming; add clinical ops action guidance in S4.4
</commit_message>
<xml_diff>
--- a/Clinical Supply Chain Subteam/White Paper/white_paper.docx
+++ b/Clinical Supply Chain Subteam/White Paper/white_paper.docx
@@ -1935,7 +1935,7 @@
         <w:pStyle w:val="BodyText"/>
       </w:pPr>
       <w:r>
-        <w:t xml:space="preserve">Where available, the analysis also reports the operational waste ratio. This ratio equals kits shipped minus kits used, divided by kits used. It supports comparison with the 30–50% industry planning range introduced in Section 2. However, operational waste ratios were not available for the parameter results presented below. The two waste measures cover different locations and use different denominators. They should not be treated as equivalent.</w:t>
+        <w:t xml:space="preserve">The operational waste ratio—kits shipped minus kits used, divided by kits used—is introduced in Section 2 as a reference for industry planning ranges. It was not calculated for the sensitivity scenarios below because the required shipped and used kit counts per scenario were not extracted from the simulation outputs. Future analyses should report both measures to support comparison with published industry benchmarks.</w:t>
       </w:r>
     </w:p>
     <w:p>
@@ -2800,6 +2800,14 @@
         <w:t xml:space="preserve">Initial site stock was not varied in this analysis. It may be an important source of waste, especially at the 15% of sites that never enroll a patient. It should be included in future sensitivity work.</w:t>
       </w:r>
     </w:p>
+    <w:p>
+      <w:pPr>
+        <w:pStyle w:val="BodyText"/>
+      </w:pPr>
+      <w:r>
+        <w:t xml:space="preserve">For clinical operations and supply teams acting on these findings: the primary operational decision is to confirm the EU site reorder target in the IRT or RTSM system before study start, and to set the EU demand protection buffer at no less than 60 days. These two settings have the greatest effect on the balance between waste and patient service in this trial design. Changes to either should be tested in a combined simulation run before implementation.</w:t>
+      </w:r>
+    </w:p>
     <w:bookmarkEnd w:id="28"/>
     <w:bookmarkStart w:id="29" w:name="connection-to-the-academic-literature"/>
     <w:p>
@@ -4544,7 +4552,7 @@
     </w:p>
     <w:bookmarkEnd w:id="44"/>
     <w:bookmarkEnd w:id="45"/>
-    <w:bookmarkStart w:id="47" w:name="glossary"/>
+    <w:bookmarkStart w:id="56" w:name="glossary"/>
     <w:p>
       <w:pPr>
         <w:pStyle w:val="Heading1"/>
@@ -5023,18 +5031,18 @@
                 <w:b/>
                 <w:bCs/>
               </w:rPr>
-              <w:t xml:space="preserve">THRESH (Reorder target)</w:t>
-            </w:r>
-          </w:p>
-        </w:tc>
-        <w:tc>
-          <w:tcPr/>
-          <w:p>
-            <w:pPr>
-              <w:pStyle w:val="Compact"/>
-            </w:pPr>
-            <w:r>
-              <w:t xml:space="preserve">The stock level that a site aims to restore after a resupply order. The baseline is 105 kits per kit type and treatment arm, tested at 70 kits; this is the replenishment target, not the order trigger.</w:t>
+              <w:t xml:space="preserve">EU site reorder target (THRESH)</w:t>
+            </w:r>
+          </w:p>
+        </w:tc>
+        <w:tc>
+          <w:tcPr/>
+          <w:p>
+            <w:pPr>
+              <w:pStyle w:val="Compact"/>
+            </w:pPr>
+            <w:r>
+              <w:t xml:space="preserve">The stock level that a site aims to restore after a resupply order, labeled THRESH top in the simulation code. The baseline is 105 kits per kit type and treatment arm, tested at 70 kits; this is the replenishment target, not the trigger threshold that initiates the order.</w:t>
             </w:r>
           </w:p>
         </w:tc>
@@ -5209,8 +5217,1553 @@
         <w:t xml:space="preserve">European Medicines Agency. Guideline on the requirements for quality documentation concerning biological investigational medicinal products in clinical trials. EMA/CHMP/BWP/534898/2008; 2012.</w:t>
       </w:r>
     </w:p>
+    <w:p>
+      <w:r>
+        <w:pict>
+          <v:rect style="width:0;height:1.5pt" o:hralign="center" o:hrstd="t" o:hr="t"/>
+        </w:pict>
+      </w:r>
+    </w:p>
     <w:bookmarkEnd w:id="46"/>
+    <w:bookmarkStart w:id="55" w:name="X9dc1c305f643b23cfeebf85e8957486af8f542e"/>
+    <w:p>
+      <w:pPr>
+        <w:pStyle w:val="Heading2"/>
+      </w:pPr>
+      <w:r>
+        <w:t xml:space="preserve">Appendix A: Example Trial Design and Simulation Parameters</w:t>
+      </w:r>
+    </w:p>
+    <w:p>
+      <w:pPr>
+        <w:pStyle w:val="FirstParagraph"/>
+      </w:pPr>
+      <w:r>
+        <w:t xml:space="preserve">The following tables describe the hypothetical trial design used throughout this paper. The design reflects a common Phase 2b/3 pattern — a weight-based dose-finding study with a global site network — and is intended to be realistic and representative. It does not describe any specific approved or ongoing study. Teams applying the simulation framework to their own study should replace these parameters with values derived from their own protocol and supply specification.</w:t>
+      </w:r>
+    </w:p>
+    <w:bookmarkStart w:id="47" w:name="a.1-trial-overview"/>
+    <w:p>
+      <w:pPr>
+        <w:pStyle w:val="Heading3"/>
+      </w:pPr>
+      <w:r>
+        <w:t xml:space="preserve">A.1 Trial Overview</w:t>
+      </w:r>
+    </w:p>
+    <w:tbl>
+      <w:tblPr>
+        <w:tblStyle w:val="Table"/>
+        <w:tblW w:type="pct" w:w="5000"/>
+        <w:tblLayout w:type="fixed"/>
+        <w:tblLook w:firstRow="1" w:lastRow="0" w:firstColumn="0" w:lastColumn="0" w:noHBand="0" w:noVBand="0" w:val="0020"/>
+      </w:tblPr>
+      <w:tblGrid>
+        <w:gridCol w:w="3960"/>
+        <w:gridCol w:w="3960"/>
+      </w:tblGrid>
+      <w:tr>
+        <w:trPr>
+          <w:tblHeader w:val="on"/>
+        </w:trPr>
+        <w:tc>
+          <w:tcPr/>
+          <w:p>
+            <w:pPr>
+              <w:pStyle w:val="Compact"/>
+            </w:pPr>
+            <w:r>
+              <w:t xml:space="preserve">Parameter</w:t>
+            </w:r>
+          </w:p>
+        </w:tc>
+        <w:tc>
+          <w:tcPr/>
+          <w:p>
+            <w:pPr>
+              <w:pStyle w:val="Compact"/>
+            </w:pPr>
+            <w:r>
+              <w:t xml:space="preserve">Value</w:t>
+            </w:r>
+          </w:p>
+        </w:tc>
+      </w:tr>
+      <w:tr>
+        <w:tc>
+          <w:tcPr/>
+          <w:p>
+            <w:pPr>
+              <w:pStyle w:val="Compact"/>
+            </w:pPr>
+            <w:r>
+              <w:t xml:space="preserve">Trial type</w:t>
+            </w:r>
+          </w:p>
+        </w:tc>
+        <w:tc>
+          <w:tcPr/>
+          <w:p>
+            <w:pPr>
+              <w:pStyle w:val="Compact"/>
+            </w:pPr>
+            <w:r>
+              <w:t xml:space="preserve">Randomized, double-blind, placebo-controlled, parallel-group</w:t>
+            </w:r>
+          </w:p>
+        </w:tc>
+      </w:tr>
+      <w:tr>
+        <w:tc>
+          <w:tcPr/>
+          <w:p>
+            <w:pPr>
+              <w:pStyle w:val="Compact"/>
+            </w:pPr>
+            <w:r>
+              <w:t xml:space="preserve">Treatment arms</w:t>
+            </w:r>
+          </w:p>
+        </w:tc>
+        <w:tc>
+          <w:tcPr/>
+          <w:p>
+            <w:pPr>
+              <w:pStyle w:val="Compact"/>
+            </w:pPr>
+            <w:r>
+              <w:t xml:space="preserve">2 (Arms A and B; 1:1 ratio)</w:t>
+            </w:r>
+          </w:p>
+        </w:tc>
+      </w:tr>
+      <w:tr>
+        <w:tc>
+          <w:tcPr/>
+          <w:p>
+            <w:pPr>
+              <w:pStyle w:val="Compact"/>
+            </w:pPr>
+            <w:r>
+              <w:t xml:space="preserve">Total patients</w:t>
+            </w:r>
+          </w:p>
+        </w:tc>
+        <w:tc>
+          <w:tcPr/>
+          <w:p>
+            <w:pPr>
+              <w:pStyle w:val="Compact"/>
+            </w:pPr>
+            <w:r>
+              <w:t xml:space="preserve">250</w:t>
+            </w:r>
+          </w:p>
+        </w:tc>
+      </w:tr>
+      <w:tr>
+        <w:tc>
+          <w:tcPr/>
+          <w:p>
+            <w:pPr>
+              <w:pStyle w:val="Compact"/>
+            </w:pPr>
+            <w:r>
+              <w:t xml:space="preserve">EU patients</w:t>
+            </w:r>
+          </w:p>
+        </w:tc>
+        <w:tc>
+          <w:tcPr/>
+          <w:p>
+            <w:pPr>
+              <w:pStyle w:val="Compact"/>
+            </w:pPr>
+            <w:r>
+              <w:t xml:space="preserve">100</w:t>
+            </w:r>
+          </w:p>
+        </w:tc>
+      </w:tr>
+      <w:tr>
+        <w:tc>
+          <w:tcPr/>
+          <w:p>
+            <w:pPr>
+              <w:pStyle w:val="Compact"/>
+            </w:pPr>
+            <w:r>
+              <w:t xml:space="preserve">China patients</w:t>
+            </w:r>
+          </w:p>
+        </w:tc>
+        <w:tc>
+          <w:tcPr/>
+          <w:p>
+            <w:pPr>
+              <w:pStyle w:val="Compact"/>
+            </w:pPr>
+            <w:r>
+              <w:t xml:space="preserve">150</w:t>
+            </w:r>
+          </w:p>
+        </w:tc>
+      </w:tr>
+      <w:tr>
+        <w:tc>
+          <w:tcPr/>
+          <w:p>
+            <w:pPr>
+              <w:pStyle w:val="Compact"/>
+            </w:pPr>
+            <w:r>
+              <w:t xml:space="preserve">Total sites</w:t>
+            </w:r>
+          </w:p>
+        </w:tc>
+        <w:tc>
+          <w:tcPr/>
+          <w:p>
+            <w:pPr>
+              <w:pStyle w:val="Compact"/>
+            </w:pPr>
+            <w:r>
+              <w:t xml:space="preserve">23 (13 EU, 10 China)</w:t>
+            </w:r>
+          </w:p>
+        </w:tc>
+      </w:tr>
+      <w:tr>
+        <w:tc>
+          <w:tcPr/>
+          <w:p>
+            <w:pPr>
+              <w:pStyle w:val="Compact"/>
+            </w:pPr>
+            <w:r>
+              <w:t xml:space="preserve">Treatment duration</w:t>
+            </w:r>
+          </w:p>
+        </w:tc>
+        <w:tc>
+          <w:tcPr/>
+          <w:p>
+            <w:pPr>
+              <w:pStyle w:val="Compact"/>
+            </w:pPr>
+            <w:r>
+              <w:t xml:space="preserve">52 weeks</w:t>
+            </w:r>
+          </w:p>
+        </w:tc>
+      </w:tr>
+      <w:tr>
+        <w:tc>
+          <w:tcPr/>
+          <w:p>
+            <w:pPr>
+              <w:pStyle w:val="Compact"/>
+            </w:pPr>
+            <w:r>
+              <w:t xml:space="preserve">Recruitment duration</w:t>
+            </w:r>
+          </w:p>
+        </w:tc>
+        <w:tc>
+          <w:tcPr/>
+          <w:p>
+            <w:pPr>
+              <w:pStyle w:val="Compact"/>
+            </w:pPr>
+            <w:r>
+              <w:t xml:space="preserve">450 days (~15 months)</w:t>
+            </w:r>
+          </w:p>
+        </w:tc>
+      </w:tr>
+      <w:tr>
+        <w:tc>
+          <w:tcPr/>
+          <w:p>
+            <w:pPr>
+              <w:pStyle w:val="Compact"/>
+            </w:pPr>
+            <w:r>
+              <w:t xml:space="preserve">Overall simulation horizon</w:t>
+            </w:r>
+          </w:p>
+        </w:tc>
+        <w:tc>
+          <w:tcPr/>
+          <w:p>
+            <w:pPr>
+              <w:pStyle w:val="Compact"/>
+            </w:pPr>
+            <w:r>
+              <w:t xml:space="preserve">~850 days</w:t>
+            </w:r>
+          </w:p>
+        </w:tc>
+      </w:tr>
+    </w:tbl>
     <w:bookmarkEnd w:id="47"/>
+    <w:bookmarkStart w:id="48" w:name="a.2-patient-recruitment"/>
+    <w:p>
+      <w:pPr>
+        <w:pStyle w:val="Heading3"/>
+      </w:pPr>
+      <w:r>
+        <w:t xml:space="preserve">A.2 Patient Recruitment</w:t>
+      </w:r>
+    </w:p>
+    <w:tbl>
+      <w:tblPr>
+        <w:tblStyle w:val="Table"/>
+        <w:tblW w:type="pct" w:w="5000"/>
+        <w:tblLayout w:type="fixed"/>
+        <w:tblLook w:firstRow="1" w:lastRow="0" w:firstColumn="0" w:lastColumn="0" w:noHBand="0" w:noVBand="0" w:val="0020"/>
+      </w:tblPr>
+      <w:tblGrid>
+        <w:gridCol w:w="3960"/>
+        <w:gridCol w:w="3960"/>
+      </w:tblGrid>
+      <w:tr>
+        <w:trPr>
+          <w:tblHeader w:val="on"/>
+        </w:trPr>
+        <w:tc>
+          <w:tcPr/>
+          <w:p>
+            <w:pPr>
+              <w:pStyle w:val="Compact"/>
+            </w:pPr>
+            <w:r>
+              <w:t xml:space="preserve">Parameter</w:t>
+            </w:r>
+          </w:p>
+        </w:tc>
+        <w:tc>
+          <w:tcPr/>
+          <w:p>
+            <w:pPr>
+              <w:pStyle w:val="Compact"/>
+            </w:pPr>
+            <w:r>
+              <w:t xml:space="preserve">Value</w:t>
+            </w:r>
+          </w:p>
+        </w:tc>
+      </w:tr>
+      <w:tr>
+        <w:tc>
+          <w:tcPr/>
+          <w:p>
+            <w:pPr>
+              <w:pStyle w:val="Compact"/>
+            </w:pPr>
+            <w:r>
+              <w:t xml:space="preserve">Site enrollment tiers</w:t>
+            </w:r>
+          </w:p>
+        </w:tc>
+        <w:tc>
+          <w:tcPr/>
+          <w:p>
+            <w:pPr>
+              <w:pStyle w:val="Compact"/>
+            </w:pPr>
+            <w:r>
+              <w:t xml:space="preserve">Low: 1 patient/month; Medium: 2/month; High: 4/month (one-third of sites each)</w:t>
+            </w:r>
+          </w:p>
+        </w:tc>
+      </w:tr>
+      <w:tr>
+        <w:tc>
+          <w:tcPr/>
+          <w:p>
+            <w:pPr>
+              <w:pStyle w:val="Compact"/>
+            </w:pPr>
+            <w:r>
+              <w:t xml:space="preserve">Screen failure rate</w:t>
+            </w:r>
+          </w:p>
+        </w:tc>
+        <w:tc>
+          <w:tcPr/>
+          <w:p>
+            <w:pPr>
+              <w:pStyle w:val="Compact"/>
+            </w:pPr>
+            <w:r>
+              <w:t xml:space="preserve">35%</w:t>
+            </w:r>
+          </w:p>
+        </w:tc>
+      </w:tr>
+      <w:tr>
+        <w:tc>
+          <w:tcPr/>
+          <w:p>
+            <w:pPr>
+              <w:pStyle w:val="Compact"/>
+            </w:pPr>
+            <w:r>
+              <w:t xml:space="preserve">Inactive sites (zero enrollment)</w:t>
+            </w:r>
+          </w:p>
+        </w:tc>
+        <w:tc>
+          <w:tcPr/>
+          <w:p>
+            <w:pPr>
+              <w:pStyle w:val="Compact"/>
+            </w:pPr>
+            <w:r>
+              <w:t xml:space="preserve">15% of sites</w:t>
+            </w:r>
+          </w:p>
+        </w:tc>
+      </w:tr>
+      <w:tr>
+        <w:tc>
+          <w:tcPr/>
+          <w:p>
+            <w:pPr>
+              <w:pStyle w:val="Compact"/>
+            </w:pPr>
+            <w:r>
+              <w:t xml:space="preserve">Treatment discontinuation</w:t>
+            </w:r>
+          </w:p>
+        </w:tc>
+        <w:tc>
+          <w:tcPr/>
+          <w:p>
+            <w:pPr>
+              <w:pStyle w:val="Compact"/>
+            </w:pPr>
+            <w:r>
+              <w:t xml:space="preserve">20% of enrolled patients over the 52-week period</w:t>
+            </w:r>
+          </w:p>
+        </w:tc>
+      </w:tr>
+      <w:tr>
+        <w:tc>
+          <w:tcPr/>
+          <w:p>
+            <w:pPr>
+              <w:pStyle w:val="Compact"/>
+            </w:pPr>
+            <w:r>
+              <w:t xml:space="preserve">Missing visit rate</w:t>
+            </w:r>
+          </w:p>
+        </w:tc>
+        <w:tc>
+          <w:tcPr/>
+          <w:p>
+            <w:pPr>
+              <w:pStyle w:val="Compact"/>
+            </w:pPr>
+            <w:r>
+              <w:t xml:space="preserve">10% per scheduled visit</w:t>
+            </w:r>
+          </w:p>
+        </w:tc>
+      </w:tr>
+      <w:tr>
+        <w:tc>
+          <w:tcPr/>
+          <w:p>
+            <w:pPr>
+              <w:pStyle w:val="Compact"/>
+            </w:pPr>
+            <w:r>
+              <w:t xml:space="preserve">Unscheduled visit rate</w:t>
+            </w:r>
+          </w:p>
+        </w:tc>
+        <w:tc>
+          <w:tcPr/>
+          <w:p>
+            <w:pPr>
+              <w:pStyle w:val="Compact"/>
+            </w:pPr>
+            <w:r>
+              <w:t xml:space="preserve">10%</w:t>
+            </w:r>
+          </w:p>
+        </w:tc>
+      </w:tr>
+    </w:tbl>
+    <w:bookmarkEnd w:id="48"/>
+    <w:bookmarkStart w:id="49" w:name="a.3-stratification-and-randomization"/>
+    <w:p>
+      <w:pPr>
+        <w:pStyle w:val="Heading3"/>
+      </w:pPr>
+      <w:r>
+        <w:t xml:space="preserve">A.3 Stratification and Randomization</w:t>
+      </w:r>
+    </w:p>
+    <w:tbl>
+      <w:tblPr>
+        <w:tblStyle w:val="Table"/>
+        <w:tblW w:type="pct" w:w="5000"/>
+        <w:tblLayout w:type="fixed"/>
+        <w:tblLook w:firstRow="1" w:lastRow="0" w:firstColumn="0" w:lastColumn="0" w:noHBand="0" w:noVBand="0" w:val="0020"/>
+      </w:tblPr>
+      <w:tblGrid>
+        <w:gridCol w:w="3960"/>
+        <w:gridCol w:w="3960"/>
+      </w:tblGrid>
+      <w:tr>
+        <w:trPr>
+          <w:tblHeader w:val="on"/>
+        </w:trPr>
+        <w:tc>
+          <w:tcPr/>
+          <w:p>
+            <w:pPr>
+              <w:pStyle w:val="Compact"/>
+            </w:pPr>
+            <w:r>
+              <w:t xml:space="preserve">Parameter</w:t>
+            </w:r>
+          </w:p>
+        </w:tc>
+        <w:tc>
+          <w:tcPr/>
+          <w:p>
+            <w:pPr>
+              <w:pStyle w:val="Compact"/>
+            </w:pPr>
+            <w:r>
+              <w:t xml:space="preserve">Value</w:t>
+            </w:r>
+          </w:p>
+        </w:tc>
+      </w:tr>
+      <w:tr>
+        <w:tc>
+          <w:tcPr/>
+          <w:p>
+            <w:pPr>
+              <w:pStyle w:val="Compact"/>
+            </w:pPr>
+            <w:r>
+              <w:t xml:space="preserve">Stratification factors</w:t>
+            </w:r>
+          </w:p>
+        </w:tc>
+        <w:tc>
+          <w:tcPr/>
+          <w:p>
+            <w:pPr>
+              <w:pStyle w:val="Compact"/>
+            </w:pPr>
+            <w:r>
+              <w:t xml:space="preserve">Region (EU / China) × Body weight (&lt;90 kg / ≥90 kg)</w:t>
+            </w:r>
+          </w:p>
+        </w:tc>
+      </w:tr>
+      <w:tr>
+        <w:tc>
+          <w:tcPr/>
+          <w:p>
+            <w:pPr>
+              <w:pStyle w:val="Compact"/>
+            </w:pPr>
+            <w:r>
+              <w:t xml:space="preserve">EU patients with body weight &lt;90 kg</w:t>
+            </w:r>
+          </w:p>
+        </w:tc>
+        <w:tc>
+          <w:tcPr/>
+          <w:p>
+            <w:pPr>
+              <w:pStyle w:val="Compact"/>
+            </w:pPr>
+            <w:r>
+              <w:t xml:space="preserve">70%</w:t>
+            </w:r>
+          </w:p>
+        </w:tc>
+      </w:tr>
+      <w:tr>
+        <w:tc>
+          <w:tcPr/>
+          <w:p>
+            <w:pPr>
+              <w:pStyle w:val="Compact"/>
+            </w:pPr>
+            <w:r>
+              <w:t xml:space="preserve">China patients with body weight &lt;90 kg</w:t>
+            </w:r>
+          </w:p>
+        </w:tc>
+        <w:tc>
+          <w:tcPr/>
+          <w:p>
+            <w:pPr>
+              <w:pStyle w:val="Compact"/>
+            </w:pPr>
+            <w:r>
+              <w:t xml:space="preserve">80%</w:t>
+            </w:r>
+          </w:p>
+        </w:tc>
+      </w:tr>
+      <w:tr>
+        <w:tc>
+          <w:tcPr/>
+          <w:p>
+            <w:pPr>
+              <w:pStyle w:val="Compact"/>
+            </w:pPr>
+            <w:r>
+              <w:t xml:space="preserve">Randomization method</w:t>
+            </w:r>
+          </w:p>
+        </w:tc>
+        <w:tc>
+          <w:tcPr/>
+          <w:p>
+            <w:pPr>
+              <w:pStyle w:val="Compact"/>
+            </w:pPr>
+            <w:r>
+              <w:t xml:space="preserve">Stratified block randomization; block sizes 4 or 6</w:t>
+            </w:r>
+          </w:p>
+        </w:tc>
+      </w:tr>
+    </w:tbl>
+    <w:bookmarkEnd w:id="49"/>
+    <w:bookmarkStart w:id="50" w:name="a.4-dosing-and-kit-configuration"/>
+    <w:p>
+      <w:pPr>
+        <w:pStyle w:val="Heading3"/>
+      </w:pPr>
+      <w:r>
+        <w:t xml:space="preserve">A.4 Dosing and Kit Configuration</w:t>
+      </w:r>
+    </w:p>
+    <w:tbl>
+      <w:tblPr>
+        <w:tblStyle w:val="Table"/>
+        <w:tblW w:type="auto" w:w="0"/>
+        <w:tblLook w:firstRow="1" w:lastRow="0" w:firstColumn="0" w:lastColumn="0" w:noHBand="0" w:noVBand="0" w:val="0020"/>
+      </w:tblPr>
+      <w:tblGrid>
+        <w:gridCol w:w="1980"/>
+        <w:gridCol w:w="1980"/>
+        <w:gridCol w:w="1980"/>
+        <w:gridCol w:w="1980"/>
+      </w:tblGrid>
+      <w:tr>
+        <w:trPr>
+          <w:tblHeader w:val="on"/>
+        </w:trPr>
+        <w:tc>
+          <w:tcPr/>
+          <w:p>
+            <w:pPr>
+              <w:pStyle w:val="Compact"/>
+            </w:pPr>
+            <w:r>
+              <w:t xml:space="preserve">Treatment phase</w:t>
+            </w:r>
+          </w:p>
+        </w:tc>
+        <w:tc>
+          <w:tcPr/>
+          <w:p>
+            <w:pPr>
+              <w:pStyle w:val="Compact"/>
+            </w:pPr>
+            <w:r>
+              <w:t xml:space="preserve">Body weight</w:t>
+            </w:r>
+          </w:p>
+        </w:tc>
+        <w:tc>
+          <w:tcPr/>
+          <w:p>
+            <w:pPr>
+              <w:pStyle w:val="Compact"/>
+            </w:pPr>
+            <w:r>
+              <w:t xml:space="preserve">Kit type</w:t>
+            </w:r>
+          </w:p>
+        </w:tc>
+        <w:tc>
+          <w:tcPr/>
+          <w:p>
+            <w:pPr>
+              <w:pStyle w:val="Compact"/>
+              <w:jc w:val="right"/>
+            </w:pPr>
+            <w:r>
+              <w:t xml:space="preserve">Kits per visit</w:t>
+            </w:r>
+          </w:p>
+        </w:tc>
+      </w:tr>
+      <w:tr>
+        <w:tc>
+          <w:tcPr/>
+          <w:p>
+            <w:pPr>
+              <w:pStyle w:val="Compact"/>
+            </w:pPr>
+            <w:r>
+              <w:t xml:space="preserve">Weeks 1–13 (weekly)</w:t>
+            </w:r>
+          </w:p>
+        </w:tc>
+        <w:tc>
+          <w:tcPr/>
+          <w:p>
+            <w:pPr>
+              <w:pStyle w:val="Compact"/>
+            </w:pPr>
+            <w:r>
+              <w:t xml:space="preserve">&lt;90 kg</w:t>
+            </w:r>
+          </w:p>
+        </w:tc>
+        <w:tc>
+          <w:tcPr/>
+          <w:p>
+            <w:pPr>
+              <w:pStyle w:val="Compact"/>
+            </w:pPr>
+            <w:r>
+              <w:t xml:space="preserve">5 ml</w:t>
+            </w:r>
+          </w:p>
+        </w:tc>
+        <w:tc>
+          <w:tcPr/>
+          <w:p>
+            <w:pPr>
+              <w:pStyle w:val="Compact"/>
+              <w:jc w:val="right"/>
+            </w:pPr>
+            <w:r>
+              <w:t xml:space="preserve">3</w:t>
+            </w:r>
+          </w:p>
+        </w:tc>
+      </w:tr>
+      <w:tr>
+        <w:tc>
+          <w:tcPr/>
+          <w:p>
+            <w:pPr>
+              <w:pStyle w:val="Compact"/>
+            </w:pPr>
+            <w:r>
+              <w:t xml:space="preserve">Weeks 1–13 (weekly)</w:t>
+            </w:r>
+          </w:p>
+        </w:tc>
+        <w:tc>
+          <w:tcPr/>
+          <w:p>
+            <w:pPr>
+              <w:pStyle w:val="Compact"/>
+            </w:pPr>
+            <w:r>
+              <w:t xml:space="preserve">≥90 kg</w:t>
+            </w:r>
+          </w:p>
+        </w:tc>
+        <w:tc>
+          <w:tcPr/>
+          <w:p>
+            <w:pPr>
+              <w:pStyle w:val="Compact"/>
+            </w:pPr>
+            <w:r>
+              <w:t xml:space="preserve">5 ml</w:t>
+            </w:r>
+          </w:p>
+        </w:tc>
+        <w:tc>
+          <w:tcPr/>
+          <w:p>
+            <w:pPr>
+              <w:pStyle w:val="Compact"/>
+              <w:jc w:val="right"/>
+            </w:pPr>
+            <w:r>
+              <w:t xml:space="preserve">5</w:t>
+            </w:r>
+          </w:p>
+        </w:tc>
+      </w:tr>
+      <w:tr>
+        <w:tc>
+          <w:tcPr/>
+          <w:p>
+            <w:pPr>
+              <w:pStyle w:val="Compact"/>
+            </w:pPr>
+            <w:r>
+              <w:t xml:space="preserve">Weeks 14–52 (bi-weekly)</w:t>
+            </w:r>
+          </w:p>
+        </w:tc>
+        <w:tc>
+          <w:tcPr/>
+          <w:p>
+            <w:pPr>
+              <w:pStyle w:val="Compact"/>
+            </w:pPr>
+            <w:r>
+              <w:t xml:space="preserve">&lt;90 kg</w:t>
+            </w:r>
+          </w:p>
+        </w:tc>
+        <w:tc>
+          <w:tcPr/>
+          <w:p>
+            <w:pPr>
+              <w:pStyle w:val="Compact"/>
+            </w:pPr>
+            <w:r>
+              <w:t xml:space="preserve">2.5 ml</w:t>
+            </w:r>
+          </w:p>
+        </w:tc>
+        <w:tc>
+          <w:tcPr/>
+          <w:p>
+            <w:pPr>
+              <w:pStyle w:val="Compact"/>
+              <w:jc w:val="right"/>
+            </w:pPr>
+            <w:r>
+              <w:t xml:space="preserve">1</w:t>
+            </w:r>
+          </w:p>
+        </w:tc>
+      </w:tr>
+      <w:tr>
+        <w:tc>
+          <w:tcPr/>
+          <w:p>
+            <w:pPr>
+              <w:pStyle w:val="Compact"/>
+            </w:pPr>
+            <w:r>
+              <w:t xml:space="preserve">Weeks 14–52 (bi-weekly)</w:t>
+            </w:r>
+          </w:p>
+        </w:tc>
+        <w:tc>
+          <w:tcPr/>
+          <w:p>
+            <w:pPr>
+              <w:pStyle w:val="Compact"/>
+            </w:pPr>
+            <w:r>
+              <w:t xml:space="preserve">≥90 kg</w:t>
+            </w:r>
+          </w:p>
+        </w:tc>
+        <w:tc>
+          <w:tcPr/>
+          <w:p>
+            <w:pPr>
+              <w:pStyle w:val="Compact"/>
+            </w:pPr>
+            <w:r>
+              <w:t xml:space="preserve">7.5 ml</w:t>
+            </w:r>
+          </w:p>
+        </w:tc>
+        <w:tc>
+          <w:tcPr/>
+          <w:p>
+            <w:pPr>
+              <w:pStyle w:val="Compact"/>
+              <w:jc w:val="right"/>
+            </w:pPr>
+            <w:r>
+              <w:t xml:space="preserve">1</w:t>
+            </w:r>
+          </w:p>
+        </w:tc>
+      </w:tr>
+    </w:tbl>
+    <w:bookmarkEnd w:id="50"/>
+    <w:bookmarkStart w:id="51" w:name="a.5-drug-shelf-life-and-dispensing-rules"/>
+    <w:p>
+      <w:pPr>
+        <w:pStyle w:val="Heading3"/>
+      </w:pPr>
+      <w:r>
+        <w:t xml:space="preserve">A.5 Drug Shelf Life and Dispensing Rules</w:t>
+      </w:r>
+    </w:p>
+    <w:tbl>
+      <w:tblPr>
+        <w:tblStyle w:val="Table"/>
+        <w:tblW w:type="pct" w:w="5000"/>
+        <w:tblLayout w:type="fixed"/>
+        <w:tblLook w:firstRow="1" w:lastRow="0" w:firstColumn="0" w:lastColumn="0" w:noHBand="0" w:noVBand="0" w:val="0020"/>
+      </w:tblPr>
+      <w:tblGrid>
+        <w:gridCol w:w="3960"/>
+        <w:gridCol w:w="3960"/>
+      </w:tblGrid>
+      <w:tr>
+        <w:trPr>
+          <w:tblHeader w:val="on"/>
+        </w:trPr>
+        <w:tc>
+          <w:tcPr/>
+          <w:p>
+            <w:pPr>
+              <w:pStyle w:val="Compact"/>
+            </w:pPr>
+            <w:r>
+              <w:t xml:space="preserve">Parameter</w:t>
+            </w:r>
+          </w:p>
+        </w:tc>
+        <w:tc>
+          <w:tcPr/>
+          <w:p>
+            <w:pPr>
+              <w:pStyle w:val="Compact"/>
+            </w:pPr>
+            <w:r>
+              <w:t xml:space="preserve">Value</w:t>
+            </w:r>
+          </w:p>
+        </w:tc>
+      </w:tr>
+      <w:tr>
+        <w:tc>
+          <w:tcPr/>
+          <w:p>
+            <w:pPr>
+              <w:pStyle w:val="Compact"/>
+            </w:pPr>
+            <w:r>
+              <w:t xml:space="preserve">Kit shelf life</w:t>
+            </w:r>
+          </w:p>
+        </w:tc>
+        <w:tc>
+          <w:tcPr/>
+          <w:p>
+            <w:pPr>
+              <w:pStyle w:val="Compact"/>
+            </w:pPr>
+            <w:r>
+              <w:t xml:space="preserve">720 days (24 months)</w:t>
+            </w:r>
+          </w:p>
+        </w:tc>
+      </w:tr>
+      <w:tr>
+        <w:tc>
+          <w:tcPr/>
+          <w:p>
+            <w:pPr>
+              <w:pStyle w:val="Compact"/>
+            </w:pPr>
+            <w:r>
+              <w:t xml:space="preserve">Do Not Dispense (DND) window</w:t>
+            </w:r>
+          </w:p>
+        </w:tc>
+        <w:tc>
+          <w:tcPr/>
+          <w:p>
+            <w:pPr>
+              <w:pStyle w:val="Compact"/>
+            </w:pPr>
+            <w:r>
+              <w:t xml:space="preserve">13 days (sponsor-defined; see Glossary)</w:t>
+            </w:r>
+          </w:p>
+        </w:tc>
+      </w:tr>
+      <w:tr>
+        <w:tc>
+          <w:tcPr/>
+          <w:p>
+            <w:pPr>
+              <w:pStyle w:val="Compact"/>
+            </w:pPr>
+            <w:r>
+              <w:t xml:space="preserve">Minimum remaining shelf life at EU depot receipt (DNS threshold)</w:t>
+            </w:r>
+          </w:p>
+        </w:tc>
+        <w:tc>
+          <w:tcPr/>
+          <w:p>
+            <w:pPr>
+              <w:pStyle w:val="Compact"/>
+            </w:pPr>
+            <w:r>
+              <w:t xml:space="preserve">195 days (6.5 months)</w:t>
+            </w:r>
+          </w:p>
+        </w:tc>
+      </w:tr>
+      <w:tr>
+        <w:tc>
+          <w:tcPr/>
+          <w:p>
+            <w:pPr>
+              <w:pStyle w:val="Compact"/>
+            </w:pPr>
+            <w:r>
+              <w:t xml:space="preserve">Minimum remaining shelf life at China depot receipt (DNS threshold)</w:t>
+            </w:r>
+          </w:p>
+        </w:tc>
+        <w:tc>
+          <w:tcPr/>
+          <w:p>
+            <w:pPr>
+              <w:pStyle w:val="Compact"/>
+            </w:pPr>
+            <w:r>
+              <w:t xml:space="preserve">270 days (9 months)</w:t>
+            </w:r>
+          </w:p>
+        </w:tc>
+      </w:tr>
+      <w:tr>
+        <w:tc>
+          <w:tcPr/>
+          <w:p>
+            <w:pPr>
+              <w:pStyle w:val="Compact"/>
+            </w:pPr>
+            <w:r>
+              <w:t xml:space="preserve">Minimum remaining shelf life at site receipt (DNS threshold)</w:t>
+            </w:r>
+          </w:p>
+        </w:tc>
+        <w:tc>
+          <w:tcPr/>
+          <w:p>
+            <w:pPr>
+              <w:pStyle w:val="Compact"/>
+            </w:pPr>
+            <w:r>
+              <w:t xml:space="preserve">180 days (6 months)</w:t>
+            </w:r>
+          </w:p>
+        </w:tc>
+      </w:tr>
+      <w:tr>
+        <w:tc>
+          <w:tcPr/>
+          <w:p>
+            <w:pPr>
+              <w:pStyle w:val="Compact"/>
+            </w:pPr>
+            <w:r>
+              <w:t xml:space="preserve">Dispensing rule</w:t>
+            </w:r>
+          </w:p>
+        </w:tc>
+        <w:tc>
+          <w:tcPr/>
+          <w:p>
+            <w:pPr>
+              <w:pStyle w:val="Compact"/>
+            </w:pPr>
+            <w:r>
+              <w:t xml:space="preserve">First Expired, First Out (FEFO)</w:t>
+            </w:r>
+          </w:p>
+        </w:tc>
+      </w:tr>
+    </w:tbl>
+    <w:bookmarkEnd w:id="51"/>
+    <w:bookmarkStart w:id="52" w:name="a.6-lead-times"/>
+    <w:p>
+      <w:pPr>
+        <w:pStyle w:val="Heading3"/>
+      </w:pPr>
+      <w:r>
+        <w:t xml:space="preserve">A.6 Lead Times</w:t>
+      </w:r>
+    </w:p>
+    <w:tbl>
+      <w:tblPr>
+        <w:tblStyle w:val="Table"/>
+        <w:tblW w:type="auto" w:w="0"/>
+        <w:tblLook w:firstRow="1" w:lastRow="0" w:firstColumn="0" w:lastColumn="0" w:noHBand="0" w:noVBand="0" w:val="0020"/>
+      </w:tblPr>
+      <w:tblGrid>
+        <w:gridCol w:w="3960"/>
+        <w:gridCol w:w="3960"/>
+      </w:tblGrid>
+      <w:tr>
+        <w:trPr>
+          <w:tblHeader w:val="on"/>
+        </w:trPr>
+        <w:tc>
+          <w:tcPr/>
+          <w:p>
+            <w:pPr>
+              <w:pStyle w:val="Compact"/>
+            </w:pPr>
+            <w:r>
+              <w:t xml:space="preserve">Shipment leg</w:t>
+            </w:r>
+          </w:p>
+        </w:tc>
+        <w:tc>
+          <w:tcPr/>
+          <w:p>
+            <w:pPr>
+              <w:pStyle w:val="Compact"/>
+              <w:jc w:val="right"/>
+            </w:pPr>
+            <w:r>
+              <w:t xml:space="preserve">Lead time</w:t>
+            </w:r>
+          </w:p>
+        </w:tc>
+      </w:tr>
+      <w:tr>
+        <w:tc>
+          <w:tcPr/>
+          <w:p>
+            <w:pPr>
+              <w:pStyle w:val="Compact"/>
+            </w:pPr>
+            <w:r>
+              <w:t xml:space="preserve">Manufacturer → EU central depot</w:t>
+            </w:r>
+          </w:p>
+        </w:tc>
+        <w:tc>
+          <w:tcPr/>
+          <w:p>
+            <w:pPr>
+              <w:pStyle w:val="Compact"/>
+              <w:jc w:val="right"/>
+            </w:pPr>
+            <w:r>
+              <w:t xml:space="preserve">7 days</w:t>
+            </w:r>
+          </w:p>
+        </w:tc>
+      </w:tr>
+      <w:tr>
+        <w:tc>
+          <w:tcPr/>
+          <w:p>
+            <w:pPr>
+              <w:pStyle w:val="Compact"/>
+            </w:pPr>
+            <w:r>
+              <w:t xml:space="preserve">EU central depot → EU clinical site</w:t>
+            </w:r>
+          </w:p>
+        </w:tc>
+        <w:tc>
+          <w:tcPr/>
+          <w:p>
+            <w:pPr>
+              <w:pStyle w:val="Compact"/>
+              <w:jc w:val="right"/>
+            </w:pPr>
+            <w:r>
+              <w:t xml:space="preserve">7 days</w:t>
+            </w:r>
+          </w:p>
+        </w:tc>
+      </w:tr>
+      <w:tr>
+        <w:tc>
+          <w:tcPr/>
+          <w:p>
+            <w:pPr>
+              <w:pStyle w:val="Compact"/>
+            </w:pPr>
+            <w:r>
+              <w:t xml:space="preserve">EU central depot → China regional depot</w:t>
+            </w:r>
+          </w:p>
+        </w:tc>
+        <w:tc>
+          <w:tcPr/>
+          <w:p>
+            <w:pPr>
+              <w:pStyle w:val="Compact"/>
+              <w:jc w:val="right"/>
+            </w:pPr>
+            <w:r>
+              <w:t xml:space="preserve">60 days</w:t>
+            </w:r>
+          </w:p>
+        </w:tc>
+      </w:tr>
+      <w:tr>
+        <w:tc>
+          <w:tcPr/>
+          <w:p>
+            <w:pPr>
+              <w:pStyle w:val="Compact"/>
+            </w:pPr>
+            <w:r>
+              <w:t xml:space="preserve">China regional depot → China clinical site</w:t>
+            </w:r>
+          </w:p>
+        </w:tc>
+        <w:tc>
+          <w:tcPr/>
+          <w:p>
+            <w:pPr>
+              <w:pStyle w:val="Compact"/>
+              <w:jc w:val="right"/>
+            </w:pPr>
+            <w:r>
+              <w:t xml:space="preserve">7 days</w:t>
+            </w:r>
+          </w:p>
+        </w:tc>
+      </w:tr>
+    </w:tbl>
+    <w:bookmarkEnd w:id="52"/>
+    <w:bookmarkStart w:id="53" w:name="a.7-inventory-and-replenishment-settings"/>
+    <w:p>
+      <w:pPr>
+        <w:pStyle w:val="Heading3"/>
+      </w:pPr>
+      <w:r>
+        <w:t xml:space="preserve">A.7 Inventory and Replenishment Settings</w:t>
+      </w:r>
+    </w:p>
+    <w:tbl>
+      <w:tblPr>
+        <w:tblStyle w:val="Table"/>
+        <w:tblW w:type="pct" w:w="5000"/>
+        <w:tblLayout w:type="fixed"/>
+        <w:tblLook w:firstRow="1" w:lastRow="0" w:firstColumn="0" w:lastColumn="0" w:noHBand="0" w:noVBand="0" w:val="0020"/>
+      </w:tblPr>
+      <w:tblGrid>
+        <w:gridCol w:w="3960"/>
+        <w:gridCol w:w="3960"/>
+      </w:tblGrid>
+      <w:tr>
+        <w:trPr>
+          <w:tblHeader w:val="on"/>
+        </w:trPr>
+        <w:tc>
+          <w:tcPr/>
+          <w:p>
+            <w:pPr>
+              <w:pStyle w:val="Compact"/>
+            </w:pPr>
+            <w:r>
+              <w:t xml:space="preserve">Parameter</w:t>
+            </w:r>
+          </w:p>
+        </w:tc>
+        <w:tc>
+          <w:tcPr/>
+          <w:p>
+            <w:pPr>
+              <w:pStyle w:val="Compact"/>
+            </w:pPr>
+            <w:r>
+              <w:t xml:space="preserve">Value</w:t>
+            </w:r>
+          </w:p>
+        </w:tc>
+      </w:tr>
+      <w:tr>
+        <w:tc>
+          <w:tcPr/>
+          <w:p>
+            <w:pPr>
+              <w:pStyle w:val="Compact"/>
+            </w:pPr>
+            <w:r>
+              <w:t xml:space="preserve">Site minimum stock threshold (per kit type × treatment arm)</w:t>
+            </w:r>
+          </w:p>
+        </w:tc>
+        <w:tc>
+          <w:tcPr/>
+          <w:p>
+            <w:pPr>
+              <w:pStyle w:val="Compact"/>
+            </w:pPr>
+            <w:r>
+              <w:t xml:space="preserve">20 kits</w:t>
+            </w:r>
+          </w:p>
+        </w:tc>
+      </w:tr>
+      <w:tr>
+        <w:tc>
+          <w:tcPr/>
+          <w:p>
+            <w:pPr>
+              <w:pStyle w:val="Compact"/>
+            </w:pPr>
+            <w:r>
+              <w:t xml:space="preserve">Site reorder target / THRESH (per kit type × treatment arm)</w:t>
+            </w:r>
+          </w:p>
+        </w:tc>
+        <w:tc>
+          <w:tcPr/>
+          <w:p>
+            <w:pPr>
+              <w:pStyle w:val="Compact"/>
+            </w:pPr>
+            <w:r>
+              <w:t xml:space="preserve">105 kits (baseline); 70 kits (recommended)</w:t>
+            </w:r>
+          </w:p>
+        </w:tc>
+      </w:tr>
+      <w:tr>
+        <w:tc>
+          <w:tcPr/>
+          <w:p>
+            <w:pPr>
+              <w:pStyle w:val="Compact"/>
+            </w:pPr>
+            <w:r>
+              <w:t xml:space="preserve">Site inventory review frequency</w:t>
+            </w:r>
+          </w:p>
+        </w:tc>
+        <w:tc>
+          <w:tcPr/>
+          <w:p>
+            <w:pPr>
+              <w:pStyle w:val="Compact"/>
+            </w:pPr>
+            <w:r>
+              <w:t xml:space="preserve">Weekly</w:t>
+            </w:r>
+          </w:p>
+        </w:tc>
+      </w:tr>
+      <w:tr>
+        <w:tc>
+          <w:tcPr/>
+          <w:p>
+            <w:pPr>
+              <w:pStyle w:val="Compact"/>
+            </w:pPr>
+            <w:r>
+              <w:t xml:space="preserve">EU central depot safety reserve before China transfer (EU_PROTECT)</w:t>
+            </w:r>
+          </w:p>
+        </w:tc>
+        <w:tc>
+          <w:tcPr/>
+          <w:p>
+            <w:pPr>
+              <w:pStyle w:val="Compact"/>
+            </w:pPr>
+            <w:r>
+              <w:t xml:space="preserve">90 days of expected EU demand</w:t>
+            </w:r>
+          </w:p>
+        </w:tc>
+      </w:tr>
+      <w:tr>
+        <w:tc>
+          <w:tcPr/>
+          <w:p>
+            <w:pPr>
+              <w:pStyle w:val="Compact"/>
+            </w:pPr>
+            <w:r>
+              <w:t xml:space="preserve">China depot daily top-up trigger</w:t>
+            </w:r>
+          </w:p>
+        </w:tc>
+        <w:tc>
+          <w:tcPr/>
+          <w:p>
+            <w:pPr>
+              <w:pStyle w:val="Compact"/>
+            </w:pPr>
+            <w:r>
+              <w:t xml:space="preserve">7 days of expected supply</w:t>
+            </w:r>
+          </w:p>
+        </w:tc>
+      </w:tr>
+    </w:tbl>
+    <w:bookmarkEnd w:id="53"/>
+    <w:bookmarkStart w:id="54" w:name="a.8-manufacturing-plan"/>
+    <w:p>
+      <w:pPr>
+        <w:pStyle w:val="Heading3"/>
+      </w:pPr>
+      <w:r>
+        <w:t xml:space="preserve">A.8 Manufacturing Plan</w:t>
+      </w:r>
+    </w:p>
+    <w:tbl>
+      <w:tblPr>
+        <w:tblStyle w:val="Table"/>
+        <w:tblW w:type="pct" w:w="5000"/>
+        <w:tblLayout w:type="fixed"/>
+        <w:tblLook w:firstRow="1" w:lastRow="0" w:firstColumn="0" w:lastColumn="0" w:noHBand="0" w:noVBand="0" w:val="0020"/>
+      </w:tblPr>
+      <w:tblGrid>
+        <w:gridCol w:w="3960"/>
+        <w:gridCol w:w="3960"/>
+      </w:tblGrid>
+      <w:tr>
+        <w:trPr>
+          <w:tblHeader w:val="on"/>
+        </w:trPr>
+        <w:tc>
+          <w:tcPr/>
+          <w:p>
+            <w:pPr>
+              <w:pStyle w:val="Compact"/>
+            </w:pPr>
+            <w:r>
+              <w:t xml:space="preserve">Parameter</w:t>
+            </w:r>
+          </w:p>
+        </w:tc>
+        <w:tc>
+          <w:tcPr/>
+          <w:p>
+            <w:pPr>
+              <w:pStyle w:val="Compact"/>
+            </w:pPr>
+            <w:r>
+              <w:t xml:space="preserve">Value</w:t>
+            </w:r>
+          </w:p>
+        </w:tc>
+      </w:tr>
+      <w:tr>
+        <w:tc>
+          <w:tcPr/>
+          <w:p>
+            <w:pPr>
+              <w:pStyle w:val="Compact"/>
+            </w:pPr>
+            <w:r>
+              <w:t xml:space="preserve">Number of planned batches</w:t>
+            </w:r>
+          </w:p>
+        </w:tc>
+        <w:tc>
+          <w:tcPr/>
+          <w:p>
+            <w:pPr>
+              <w:pStyle w:val="Compact"/>
+            </w:pPr>
+            <w:r>
+              <w:t xml:space="preserve">8</w:t>
+            </w:r>
+          </w:p>
+        </w:tc>
+      </w:tr>
+      <w:tr>
+        <w:tc>
+          <w:tcPr/>
+          <w:p>
+            <w:pPr>
+              <w:pStyle w:val="Compact"/>
+            </w:pPr>
+            <w:r>
+              <w:t xml:space="preserve">Batch interval</w:t>
+            </w:r>
+          </w:p>
+        </w:tc>
+        <w:tc>
+          <w:tcPr/>
+          <w:p>
+            <w:pPr>
+              <w:pStyle w:val="Compact"/>
+            </w:pPr>
+            <w:r>
+              <w:t xml:space="preserve">60 days (Day 0, 60, 120, … 420)</w:t>
+            </w:r>
+          </w:p>
+        </w:tc>
+      </w:tr>
+      <w:tr>
+        <w:tc>
+          <w:tcPr/>
+          <w:p>
+            <w:pPr>
+              <w:pStyle w:val="Compact"/>
+            </w:pPr>
+            <w:r>
+              <w:t xml:space="preserve">Batch size basis</w:t>
+            </w:r>
+          </w:p>
+        </w:tc>
+        <w:tc>
+          <w:tcPr/>
+          <w:p>
+            <w:pPr>
+              <w:pStyle w:val="Compact"/>
+            </w:pPr>
+            <w:r>
+              <w:t xml:space="preserve">150-day coverage window + 60-day safety stock = ~210 days of expected demand</w:t>
+            </w:r>
+          </w:p>
+        </w:tc>
+      </w:tr>
+      <w:tr>
+        <w:tc>
+          <w:tcPr/>
+          <w:p>
+            <w:pPr>
+              <w:pStyle w:val="Compact"/>
+            </w:pPr>
+            <w:r>
+              <w:t xml:space="preserve">Shipment damage rate</w:t>
+            </w:r>
+          </w:p>
+        </w:tc>
+        <w:tc>
+          <w:tcPr/>
+          <w:p>
+            <w:pPr>
+              <w:pStyle w:val="Compact"/>
+            </w:pPr>
+            <w:r>
+              <w:t xml:space="preserve">1% per shipment</w:t>
+            </w:r>
+          </w:p>
+        </w:tc>
+      </w:tr>
+    </w:tbl>
+    <w:bookmarkEnd w:id="54"/>
+    <w:bookmarkEnd w:id="55"/>
+    <w:bookmarkEnd w:id="56"/>
     <w:sectPr>
       <w:footnotePr>
         <w:numRestart w:val="eachSect"/>

</xml_diff>